<commit_message>
Point docs at the new repository home
Co-Authored-By: Claude Fable 5 <noreply@anthropic.com>
</commit_message>
<xml_diff>
--- a/docs/MANUAL_STEPS.docx
+++ b/docs/MANUAL_STEPS.docx
@@ -996,7 +996,7 @@
         <w:spacing w:after="60"/>
       </w:pPr>
       <w:r>
-        <w:t xml:space="preserve">Open https://github.com/sharia143/nhs-winter-pressure — check the README renders and figures show.</w:t>
+        <w:t xml:space="preserve">Open https://github.com/sharia143/nhs-winter-pressure-intelligence — check the README renders and figures show.</w:t>
       </w:r>
     </w:p>
     <w:p>
@@ -1022,7 +1022,7 @@
         <w:spacing w:after="60"/>
       </w:pPr>
       <w:r>
-        <w:t xml:space="preserve">On your profile page → Customize your pins → tick nhs-winter-pressure.</w:t>
+        <w:t xml:space="preserve">On your profile page → Customize your pins → tick nhs-winter-pressure-intelligence.</w:t>
       </w:r>
     </w:p>
     <w:p>

</xml_diff>